<commit_message>
Final submission: Programming Exercise 1
</commit_message>
<xml_diff>
--- a/Programming_exercise_1/MariaGalante_ProgrammingExercise_1.docx
+++ b/Programming_exercise_1/MariaGalante_ProgrammingExercise_1.docx
@@ -4,10 +4,17 @@
   <w:body>
     <w:p>
       <w:pPr>
-        <w:pStyle w:val="Title"/>
+        <w:rPr>
+          <w:b/>
+          <w:bCs/>
+        </w:rPr>
       </w:pPr>
       <w:r>
-        <w:t>Technical Design Document</w:t>
+        <w:rPr>
+          <w:b/>
+          <w:bCs/>
+        </w:rPr>
+        <w:t># Technical Design Document: MariaGalante_ProgrammingExercise_1</w:t>
       </w:r>
     </w:p>
     <w:p>
@@ -17,20 +24,6 @@
           <w:bCs/>
         </w:rPr>
       </w:pPr>
-      <w:r>
-        <w:rPr>
-          <w:b/>
-          <w:bCs/>
-        </w:rPr>
-        <w:t>Programming Exercise 1</w:t>
-      </w:r>
-    </w:p>
-    <w:p>
-      <w:r>
-        <w:pict w14:anchorId="135D21E6">
-          <v:rect id="_x0000_i1061" style="width:0;height:1.5pt" o:hralign="center" o:hrstd="t" o:hr="t" fillcolor="#a0a0a0" stroked="f"/>
-        </w:pict>
-      </w:r>
     </w:p>
     <w:p>
       <w:pPr>
@@ -44,39 +37,34 @@
           <w:b/>
           <w:bCs/>
         </w:rPr>
-        <w:t>Student Information</w:t>
-      </w:r>
-    </w:p>
-    <w:p>
-      <w:r>
-        <w:rPr>
-          <w:b/>
-          <w:bCs/>
-        </w:rPr>
-        <w:t>Name:</w:t>
-      </w:r>
-      <w:r>
-        <w:t xml:space="preserve"> Maria Galante</w:t>
-      </w:r>
-      <w:r>
-        <w:br/>
-      </w:r>
-      <w:r>
-        <w:rPr>
-          <w:b/>
-          <w:bCs/>
-        </w:rPr>
-        <w:t>Date Created:</w:t>
-      </w:r>
-      <w:r>
-        <w:t xml:space="preserve"> 01/21/2026</w:t>
-      </w:r>
-    </w:p>
-    <w:p>
-      <w:r>
-        <w:pict w14:anchorId="76EA2122">
-          <v:rect id="_x0000_i1062" style="width:0;height:1.5pt" o:hralign="center" o:hrstd="t" o:hr="t" fillcolor="#a0a0a0" stroked="f"/>
-        </w:pict>
+        <w:t xml:space="preserve"># Name: </w:t>
+      </w:r>
+      <w:r>
+        <w:t>Maria Galante</w:t>
+      </w:r>
+    </w:p>
+    <w:p>
+      <w:r>
+        <w:rPr>
+          <w:b/>
+          <w:bCs/>
+        </w:rPr>
+        <w:t xml:space="preserve"># Date: </w:t>
+      </w:r>
+      <w:r>
+        <w:t>January 21, 2026</w:t>
+      </w:r>
+    </w:p>
+    <w:p>
+      <w:r>
+        <w:rPr>
+          <w:b/>
+          <w:bCs/>
+        </w:rPr>
+        <w:t># Program Description:</w:t>
+      </w:r>
+      <w:r>
+        <w:t xml:space="preserve"> This program simulates the pre-sale of cinema tickets with purchase limits and input validation.</w:t>
       </w:r>
     </w:p>
     <w:p>
@@ -86,31 +74,6 @@
           <w:bCs/>
         </w:rPr>
       </w:pPr>
-      <w:r>
-        <w:rPr>
-          <w:b/>
-          <w:bCs/>
-        </w:rPr>
-        <w:t>Program Description</w:t>
-      </w:r>
-    </w:p>
-    <w:p>
-      <w:r>
-        <w:t xml:space="preserve">This program simulates the pre-sale of cinema tickets. A maximum of 20 tickets can be sold in total, and each buyer may purchase up to </w:t>
-      </w:r>
-      <w:r>
-        <w:t xml:space="preserve">4 </w:t>
-      </w:r>
-      <w:r>
-        <w:t>tickets per transaction. The program repeatedly prompts users for ticket requests, validates input, updates the remaining ticket count, and continues until all tickets are sold. Once sold out, the program displays the total number of buyers.</w:t>
-      </w:r>
-    </w:p>
-    <w:p>
-      <w:r>
-        <w:pict w14:anchorId="0F06187B">
-          <v:rect id="_x0000_i1063" style="width:0;height:1.5pt" o:hralign="center" o:hrstd="t" o:hr="t" fillcolor="#a0a0a0" stroked="f"/>
-        </w:pict>
-      </w:r>
     </w:p>
     <w:p>
       <w:pPr>
@@ -124,9 +87,86 @@
           <w:b/>
           <w:bCs/>
         </w:rPr>
-        <w:t>Functions</w:t>
-      </w:r>
-    </w:p>
+        <w:t xml:space="preserve">## Function: </w:t>
+      </w:r>
+      <w:proofErr w:type="spellStart"/>
+      <w:r>
+        <w:rPr>
+          <w:b/>
+          <w:bCs/>
+        </w:rPr>
+        <w:t>display_summary</w:t>
+      </w:r>
+      <w:proofErr w:type="spellEnd"/>
+    </w:p>
+    <w:p>
+      <w:r>
+        <w:t xml:space="preserve">Displays the </w:t>
+      </w:r>
+      <w:proofErr w:type="gramStart"/>
+      <w:r>
+        <w:t>final results</w:t>
+      </w:r>
+      <w:proofErr w:type="gramEnd"/>
+      <w:r>
+        <w:t xml:space="preserve"> after tickets are sold out.</w:t>
+      </w:r>
+    </w:p>
+    <w:p/>
+    <w:p>
+      <w:r>
+        <w:t>Parameters:</w:t>
+      </w:r>
+    </w:p>
+    <w:p>
+      <w:proofErr w:type="spellStart"/>
+      <w:r>
+        <w:t>total_buyers</w:t>
+      </w:r>
+      <w:proofErr w:type="spellEnd"/>
+      <w:r>
+        <w:t xml:space="preserve"> (int): Total number of buyers.</w:t>
+      </w:r>
+    </w:p>
+    <w:p/>
+    <w:p>
+      <w:r>
+        <w:t>Variables:</w:t>
+      </w:r>
+    </w:p>
+    <w:p>
+      <w:r>
+        <w:t>None</w:t>
+      </w:r>
+    </w:p>
+    <w:p/>
+    <w:p>
+      <w:r>
+        <w:t>Logic:</w:t>
+      </w:r>
+    </w:p>
+    <w:p>
+      <w:r>
+        <w:t>1. Display SOLD OUT message.</w:t>
+      </w:r>
+    </w:p>
+    <w:p>
+      <w:r>
+        <w:t>2. Display total buyers.</w:t>
+      </w:r>
+    </w:p>
+    <w:p/>
+    <w:p>
+      <w:r>
+        <w:t>Return:</w:t>
+      </w:r>
+    </w:p>
+    <w:p>
+      <w:r>
+        <w:t>None</w:t>
+      </w:r>
+    </w:p>
+    <w:p/>
     <w:p>
       <w:pPr>
         <w:rPr>
@@ -134,39 +174,139 @@
           <w:bCs/>
         </w:rPr>
       </w:pPr>
+      <w:r>
+        <w:rPr>
+          <w:b/>
+          <w:bCs/>
+        </w:rPr>
+        <w:t xml:space="preserve">## Function: </w:t>
+      </w:r>
       <w:proofErr w:type="spellStart"/>
       <w:r>
         <w:rPr>
           <w:b/>
           <w:bCs/>
         </w:rPr>
-        <w:t>sell_</w:t>
-      </w:r>
-      <w:proofErr w:type="gramStart"/>
-      <w:r>
-        <w:rPr>
-          <w:b/>
-          <w:bCs/>
-        </w:rPr>
-        <w:t>tickets</w:t>
+        <w:t>sell_tickets</w:t>
       </w:r>
       <w:proofErr w:type="spellEnd"/>
-      <w:r>
-        <w:rPr>
-          <w:b/>
-          <w:bCs/>
-        </w:rPr>
-        <w:t>(</w:t>
-      </w:r>
-      <w:proofErr w:type="gramEnd"/>
-      <w:r>
-        <w:rPr>
-          <w:b/>
-          <w:bCs/>
-        </w:rPr>
-        <w:t>)</w:t>
-      </w:r>
-    </w:p>
+    </w:p>
+    <w:p>
+      <w:r>
+        <w:t>Controls the ticket selling process until all tickets are sold.</w:t>
+      </w:r>
+    </w:p>
+    <w:p/>
+    <w:p>
+      <w:r>
+        <w:lastRenderedPageBreak/>
+        <w:t>Parameters:</w:t>
+      </w:r>
+    </w:p>
+    <w:p>
+      <w:r>
+        <w:t>None</w:t>
+      </w:r>
+    </w:p>
+    <w:p/>
+    <w:p>
+      <w:r>
+        <w:t>Variables:</w:t>
+      </w:r>
+    </w:p>
+    <w:p>
+      <w:proofErr w:type="spellStart"/>
+      <w:r>
+        <w:t>total_tickets</w:t>
+      </w:r>
+      <w:proofErr w:type="spellEnd"/>
+      <w:r>
+        <w:t xml:space="preserve"> (int): Tracks how many tickets are still available.</w:t>
+      </w:r>
+    </w:p>
+    <w:p>
+      <w:r>
+        <w:t>buyers (int): Accumulator that counts total buyers.</w:t>
+      </w:r>
+    </w:p>
+    <w:p>
+      <w:proofErr w:type="spellStart"/>
+      <w:r>
+        <w:t>request_raw</w:t>
+      </w:r>
+      <w:proofErr w:type="spellEnd"/>
+      <w:r>
+        <w:t xml:space="preserve"> (str): Raw user input before conversion to int.</w:t>
+      </w:r>
+    </w:p>
+    <w:p>
+      <w:proofErr w:type="spellStart"/>
+      <w:r>
+        <w:t>requested_tickets</w:t>
+      </w:r>
+      <w:proofErr w:type="spellEnd"/>
+      <w:r>
+        <w:t xml:space="preserve"> (int): Number of tickets requested by the current buyer.</w:t>
+      </w:r>
+    </w:p>
+    <w:p/>
+    <w:p>
+      <w:r>
+        <w:t>Logic:</w:t>
+      </w:r>
+    </w:p>
+    <w:p>
+      <w:r>
+        <w:t>1. Initialize total of tickets to be sold.</w:t>
+      </w:r>
+    </w:p>
+    <w:p>
+      <w:r>
+        <w:t>2. Initialize buyer counter to 0.</w:t>
+      </w:r>
+    </w:p>
+    <w:p>
+      <w:r>
+        <w:t>3. Loop while tickets remain.</w:t>
+      </w:r>
+    </w:p>
+    <w:p>
+      <w:r>
+        <w:t>4. Prompt user for ticket amount.</w:t>
+      </w:r>
+    </w:p>
+    <w:p>
+      <w:r>
+        <w:t>5. Validate input using if statements.</w:t>
+      </w:r>
+    </w:p>
+    <w:p>
+      <w:r>
+        <w:t>6. Subtract tickets from total tickets.</w:t>
+      </w:r>
+    </w:p>
+    <w:p>
+      <w:r>
+        <w:t>7. Increment buyer accumulator.</w:t>
+      </w:r>
+    </w:p>
+    <w:p>
+      <w:r>
+        <w:t>8. Repeat until sold out.</w:t>
+      </w:r>
+    </w:p>
+    <w:p/>
+    <w:p>
+      <w:r>
+        <w:t>Return:</w:t>
+      </w:r>
+    </w:p>
+    <w:p>
+      <w:r>
+        <w:t>buyers (int): Total number of buyers.</w:t>
+      </w:r>
+    </w:p>
+    <w:p/>
     <w:p>
       <w:pPr>
         <w:rPr>
@@ -176,243 +316,21 @@
       </w:pPr>
       <w:r>
         <w:rPr>
-          <w:i/>
-          <w:iCs/>
-        </w:rPr>
-        <w:br/>
-        <w:t>Controls the ticket selling process until all tickets are sold.</w:t>
-      </w:r>
-      <w:r>
-        <w:rPr>
-          <w:i/>
-          <w:iCs/>
-        </w:rPr>
-        <w:br/>
-      </w:r>
-      <w:r>
-        <w:rPr>
-          <w:i/>
-          <w:iCs/>
-        </w:rPr>
-        <w:br/>
-        <w:t>Parameters:</w:t>
-      </w:r>
-      <w:r>
-        <w:rPr>
-          <w:i/>
-          <w:iCs/>
-        </w:rPr>
-        <w:br/>
-        <w:t>None</w:t>
-      </w:r>
-      <w:r>
-        <w:rPr>
-          <w:i/>
-          <w:iCs/>
-        </w:rPr>
-        <w:br/>
-      </w:r>
-      <w:r>
-        <w:rPr>
-          <w:i/>
-          <w:iCs/>
-        </w:rPr>
-        <w:br/>
-        <w:t>Variables:</w:t>
-      </w:r>
-      <w:r>
-        <w:rPr>
-          <w:i/>
-          <w:iCs/>
-        </w:rPr>
-        <w:br/>
-      </w:r>
-      <w:proofErr w:type="spellStart"/>
-      <w:r>
-        <w:rPr>
-          <w:i/>
-          <w:iCs/>
-        </w:rPr>
-        <w:t>total_tickets</w:t>
-      </w:r>
-      <w:proofErr w:type="spellEnd"/>
-      <w:r>
-        <w:rPr>
-          <w:i/>
-          <w:iCs/>
-        </w:rPr>
-        <w:t xml:space="preserve"> (int): Tracks how many tickets are still available.</w:t>
-      </w:r>
-      <w:r>
-        <w:rPr>
-          <w:i/>
-          <w:iCs/>
-        </w:rPr>
-        <w:br/>
-        <w:t>buyers (int): Accumulator that counts total buyers.</w:t>
-      </w:r>
-      <w:r>
-        <w:rPr>
-          <w:i/>
-          <w:iCs/>
-        </w:rPr>
-        <w:br/>
-      </w:r>
-      <w:proofErr w:type="spellStart"/>
-      <w:r>
-        <w:rPr>
-          <w:i/>
-          <w:iCs/>
-        </w:rPr>
-        <w:t>request_raw</w:t>
-      </w:r>
-      <w:proofErr w:type="spellEnd"/>
-      <w:r>
-        <w:rPr>
-          <w:i/>
-          <w:iCs/>
-        </w:rPr>
-        <w:t xml:space="preserve"> (str): Raw user input before conversion to int.</w:t>
-      </w:r>
-      <w:r>
-        <w:rPr>
-          <w:i/>
-          <w:iCs/>
-        </w:rPr>
-        <w:br/>
-      </w:r>
-      <w:proofErr w:type="spellStart"/>
-      <w:r>
-        <w:rPr>
-          <w:i/>
-          <w:iCs/>
-        </w:rPr>
-        <w:t>requested_tickets</w:t>
-      </w:r>
-      <w:proofErr w:type="spellEnd"/>
-      <w:r>
-        <w:rPr>
-          <w:i/>
-          <w:iCs/>
-        </w:rPr>
-        <w:t xml:space="preserve"> (int): Number of tickets requested by the current buyer.</w:t>
-      </w:r>
-      <w:r>
-        <w:rPr>
-          <w:i/>
-          <w:iCs/>
-        </w:rPr>
-        <w:br/>
-      </w:r>
-      <w:r>
-        <w:rPr>
-          <w:i/>
-          <w:iCs/>
-        </w:rPr>
-        <w:br/>
-        <w:t>Logic:</w:t>
-      </w:r>
-      <w:r>
-        <w:rPr>
-          <w:i/>
-          <w:iCs/>
-        </w:rPr>
-        <w:br/>
-        <w:t>1. Initialize total of tickets to be sold.</w:t>
-      </w:r>
-      <w:r>
-        <w:rPr>
-          <w:i/>
-          <w:iCs/>
-        </w:rPr>
-        <w:br/>
-        <w:t>2. Initialize buyer counter to 0.</w:t>
-      </w:r>
-      <w:r>
-        <w:rPr>
-          <w:i/>
-          <w:iCs/>
-        </w:rPr>
-        <w:br/>
-        <w:t>3. Loop while tickets remain.</w:t>
-      </w:r>
-      <w:r>
-        <w:rPr>
-          <w:i/>
-          <w:iCs/>
-        </w:rPr>
-        <w:br/>
-      </w:r>
-      <w:r>
-        <w:rPr>
-          <w:i/>
-          <w:iCs/>
-        </w:rPr>
-        <w:lastRenderedPageBreak/>
-        <w:t>4. Prompt user for ticket amount.</w:t>
-      </w:r>
-      <w:r>
-        <w:rPr>
-          <w:i/>
-          <w:iCs/>
-        </w:rPr>
-        <w:br/>
-        <w:t>5. Validate input using if statements.</w:t>
-      </w:r>
-      <w:r>
-        <w:rPr>
-          <w:i/>
-          <w:iCs/>
-        </w:rPr>
-        <w:br/>
-        <w:t>6. Subtract tickets from total tickets.</w:t>
-      </w:r>
-      <w:r>
-        <w:rPr>
-          <w:i/>
-          <w:iCs/>
-        </w:rPr>
-        <w:br/>
-        <w:t>7. Increment buyer accumulator.</w:t>
-      </w:r>
-      <w:r>
-        <w:rPr>
-          <w:i/>
-          <w:iCs/>
-        </w:rPr>
-        <w:br/>
-        <w:t>8. Repeat until sold out.</w:t>
-      </w:r>
-      <w:r>
-        <w:rPr>
-          <w:i/>
-          <w:iCs/>
-        </w:rPr>
-        <w:br/>
-      </w:r>
-      <w:r>
-        <w:rPr>
-          <w:i/>
-          <w:iCs/>
-        </w:rPr>
-        <w:br/>
-        <w:t>Return:</w:t>
-      </w:r>
-      <w:r>
-        <w:rPr>
-          <w:i/>
-          <w:iCs/>
-        </w:rPr>
-        <w:br/>
-        <w:t>buyers (int): Total number of buyers.</w:t>
-      </w:r>
-    </w:p>
-    <w:p>
-      <w:r>
-        <w:pict w14:anchorId="77E5D55C">
-          <v:rect id="_x0000_i1064" style="width:0;height:1.5pt" o:hralign="center" o:hrstd="t" o:hr="t" fillcolor="#a0a0a0" stroked="f"/>
-        </w:pict>
-      </w:r>
+          <w:b/>
+          <w:bCs/>
+        </w:rPr>
+        <w:t xml:space="preserve"># Link to your repository: </w:t>
+      </w:r>
+      <w:hyperlink r:id="rId4" w:history="1">
+        <w:r>
+          <w:rPr>
+            <w:rStyle w:val="Hyperlink"/>
+            <w:b/>
+            <w:bCs/>
+          </w:rPr>
+          <w:t>https://github.com/ggriaa/COP2373</w:t>
+        </w:r>
+      </w:hyperlink>
     </w:p>
     <w:p>
       <w:pPr>
@@ -421,178 +339,6 @@
           <w:bCs/>
         </w:rPr>
       </w:pPr>
-      <w:proofErr w:type="spellStart"/>
-      <w:r>
-        <w:rPr>
-          <w:b/>
-          <w:bCs/>
-        </w:rPr>
-        <w:t>display_summary</w:t>
-      </w:r>
-      <w:proofErr w:type="spellEnd"/>
-      <w:r>
-        <w:rPr>
-          <w:b/>
-          <w:bCs/>
-        </w:rPr>
-        <w:t>(</w:t>
-      </w:r>
-      <w:proofErr w:type="spellStart"/>
-      <w:r>
-        <w:rPr>
-          <w:b/>
-          <w:bCs/>
-        </w:rPr>
-        <w:t>total_buyers</w:t>
-      </w:r>
-      <w:proofErr w:type="spellEnd"/>
-      <w:r>
-        <w:rPr>
-          <w:b/>
-          <w:bCs/>
-        </w:rPr>
-        <w:t>)</w:t>
-      </w:r>
-    </w:p>
-    <w:p>
-      <w:r>
-        <w:rPr>
-          <w:i/>
-          <w:iCs/>
-        </w:rPr>
-        <w:t xml:space="preserve">Displays the </w:t>
-      </w:r>
-      <w:proofErr w:type="gramStart"/>
-      <w:r>
-        <w:rPr>
-          <w:i/>
-          <w:iCs/>
-        </w:rPr>
-        <w:t>final results</w:t>
-      </w:r>
-      <w:proofErr w:type="gramEnd"/>
-      <w:r>
-        <w:rPr>
-          <w:i/>
-          <w:iCs/>
-        </w:rPr>
-        <w:t xml:space="preserve"> after tickets are sold out.</w:t>
-      </w:r>
-      <w:r>
-        <w:rPr>
-          <w:i/>
-          <w:iCs/>
-        </w:rPr>
-        <w:br/>
-      </w:r>
-      <w:r>
-        <w:rPr>
-          <w:i/>
-          <w:iCs/>
-        </w:rPr>
-        <w:br/>
-        <w:t>Parameters:</w:t>
-      </w:r>
-      <w:r>
-        <w:rPr>
-          <w:i/>
-          <w:iCs/>
-        </w:rPr>
-        <w:br/>
-      </w:r>
-      <w:proofErr w:type="spellStart"/>
-      <w:r>
-        <w:rPr>
-          <w:i/>
-          <w:iCs/>
-        </w:rPr>
-        <w:t>total_buyers</w:t>
-      </w:r>
-      <w:proofErr w:type="spellEnd"/>
-      <w:r>
-        <w:rPr>
-          <w:i/>
-          <w:iCs/>
-        </w:rPr>
-        <w:t xml:space="preserve"> (int): Total number of buyers.</w:t>
-      </w:r>
-      <w:r>
-        <w:rPr>
-          <w:i/>
-          <w:iCs/>
-        </w:rPr>
-        <w:br/>
-      </w:r>
-      <w:r>
-        <w:rPr>
-          <w:i/>
-          <w:iCs/>
-        </w:rPr>
-        <w:br/>
-        <w:t>Variables:</w:t>
-      </w:r>
-      <w:r>
-        <w:rPr>
-          <w:i/>
-          <w:iCs/>
-        </w:rPr>
-        <w:br/>
-        <w:t>None</w:t>
-      </w:r>
-      <w:r>
-        <w:rPr>
-          <w:i/>
-          <w:iCs/>
-        </w:rPr>
-        <w:br/>
-      </w:r>
-      <w:r>
-        <w:rPr>
-          <w:i/>
-          <w:iCs/>
-        </w:rPr>
-        <w:br/>
-        <w:t>Logic:</w:t>
-      </w:r>
-      <w:r>
-        <w:rPr>
-          <w:i/>
-          <w:iCs/>
-        </w:rPr>
-        <w:br/>
-        <w:t>1. Display SOLD OUT message.</w:t>
-      </w:r>
-      <w:r>
-        <w:rPr>
-          <w:i/>
-          <w:iCs/>
-        </w:rPr>
-        <w:br/>
-        <w:t>2. Display total buyers.</w:t>
-      </w:r>
-      <w:r>
-        <w:rPr>
-          <w:i/>
-          <w:iCs/>
-        </w:rPr>
-        <w:br/>
-      </w:r>
-      <w:r>
-        <w:rPr>
-          <w:i/>
-          <w:iCs/>
-        </w:rPr>
-        <w:br/>
-        <w:t>Return:</w:t>
-      </w:r>
-      <w:r>
-        <w:rPr>
-          <w:i/>
-          <w:iCs/>
-        </w:rPr>
-        <w:br/>
-        <w:t>None</w:t>
-      </w:r>
     </w:p>
     <w:p>
       <w:pPr>
@@ -603,36 +349,12 @@
       </w:pPr>
     </w:p>
     <w:p>
-      <w:r>
-        <w:pict w14:anchorId="473730D8">
-          <v:rect id="_x0000_i1065" style="width:0;height:1.5pt" o:hralign="center" o:hrstd="t" o:hr="t" fillcolor="#a0a0a0" stroked="f"/>
-        </w:pict>
-      </w:r>
-    </w:p>
-    <w:p>
       <w:pPr>
         <w:rPr>
           <w:b/>
           <w:bCs/>
         </w:rPr>
       </w:pPr>
-      <w:r>
-        <w:rPr>
-          <w:b/>
-          <w:bCs/>
-        </w:rPr>
-        <w:t>GitHub Repository Link</w:t>
-      </w:r>
-    </w:p>
-    <w:p>
-      <w:r>
-        <w:t>https://github.com/ggriaa/COP2373.git</w:t>
-      </w:r>
-      <w:r>
-        <w:pict w14:anchorId="2B59A337">
-          <v:rect id="_x0000_i1066" style="width:0;height:1.5pt" o:hralign="center" o:hrstd="t" o:hr="t" fillcolor="#a0a0a0" stroked="f"/>
-        </w:pict>
-      </w:r>
     </w:p>
     <w:p>
       <w:pPr>
@@ -649,6 +371,20 @@
           <w:bCs/>
         </w:rPr>
       </w:pPr>
+      <w:r>
+        <w:rPr>
+          <w:b/>
+          <w:bCs/>
+        </w:rPr>
+        <w:t>Program Output Screenshot</w:t>
+      </w:r>
+      <w:r>
+        <w:rPr>
+          <w:b/>
+          <w:bCs/>
+        </w:rPr>
+        <w:t>:</w:t>
+      </w:r>
     </w:p>
     <w:p>
       <w:pPr>
@@ -657,41 +393,17 @@
           <w:bCs/>
         </w:rPr>
       </w:pPr>
-    </w:p>
-    <w:p>
-      <w:pPr>
-        <w:rPr>
-          <w:b/>
-          <w:bCs/>
-        </w:rPr>
-      </w:pPr>
-    </w:p>
-    <w:p>
-      <w:pPr>
-        <w:rPr>
-          <w:b/>
-          <w:bCs/>
-        </w:rPr>
-      </w:pPr>
-      <w:r>
-        <w:rPr>
-          <w:b/>
-          <w:bCs/>
-        </w:rPr>
-        <w:lastRenderedPageBreak/>
-        <w:t>Program Output Screenshot</w:t>
-      </w:r>
-    </w:p>
-    <w:p>
-      <w:r>
-        <w:rPr>
+      <w:r>
+        <w:rPr>
+          <w:b/>
+          <w:bCs/>
           <w:noProof/>
         </w:rPr>
         <w:drawing>
-          <wp:inline distT="0" distB="0" distL="0" distR="0" wp14:anchorId="0ED3053C" wp14:editId="604D1D67">
-            <wp:extent cx="5943600" cy="3411855"/>
-            <wp:effectExtent l="0" t="0" r="0" b="0"/>
-            <wp:docPr id="1648576977" name="Picture 1"/>
+          <wp:inline distT="0" distB="0" distL="0" distR="0" wp14:anchorId="741888A9" wp14:editId="7F929D03">
+            <wp:extent cx="5021580" cy="2882580"/>
+            <wp:effectExtent l="0" t="0" r="7620" b="0"/>
+            <wp:docPr id="1467782418" name="Picture 1"/>
             <wp:cNvGraphicFramePr>
               <a:graphicFrameLocks xmlns:a="http://schemas.openxmlformats.org/drawingml/2006/main" noChangeAspect="1"/>
             </wp:cNvGraphicFramePr>
@@ -699,11 +411,11 @@
               <a:graphicData uri="http://schemas.openxmlformats.org/drawingml/2006/picture">
                 <pic:pic xmlns:pic="http://schemas.openxmlformats.org/drawingml/2006/picture">
                   <pic:nvPicPr>
-                    <pic:cNvPr id="1648576977" name="Picture 1648576977"/>
+                    <pic:cNvPr id="1467782418" name="Picture 1467782418"/>
                     <pic:cNvPicPr/>
                   </pic:nvPicPr>
                   <pic:blipFill>
-                    <a:blip r:embed="rId7">
+                    <a:blip r:embed="rId5">
                       <a:extLst>
                         <a:ext uri="{28A0092B-C50C-407E-A947-70E740481C1C}">
                           <a14:useLocalDpi xmlns:a14="http://schemas.microsoft.com/office/drawing/2010/main" val="0"/>
@@ -717,7 +429,7 @@
                   <pic:spPr>
                     <a:xfrm>
                       <a:off x="0" y="0"/>
-                      <a:ext cx="5943600" cy="3411855"/>
+                      <a:ext cx="5027864" cy="2886187"/>
                     </a:xfrm>
                     <a:prstGeom prst="rect">
                       <a:avLst/>
@@ -1148,7 +860,7 @@
     <w:link w:val="Heading1Char"/>
     <w:uiPriority w:val="9"/>
     <w:qFormat/>
-    <w:rsid w:val="006B7A04"/>
+    <w:rsid w:val="004A0A1F"/>
     <w:pPr>
       <w:keepNext/>
       <w:keepLines/>
@@ -1171,7 +883,7 @@
     <w:semiHidden/>
     <w:unhideWhenUsed/>
     <w:qFormat/>
-    <w:rsid w:val="006B7A04"/>
+    <w:rsid w:val="004A0A1F"/>
     <w:pPr>
       <w:keepNext/>
       <w:keepLines/>
@@ -1194,7 +906,7 @@
     <w:semiHidden/>
     <w:unhideWhenUsed/>
     <w:qFormat/>
-    <w:rsid w:val="006B7A04"/>
+    <w:rsid w:val="004A0A1F"/>
     <w:pPr>
       <w:keepNext/>
       <w:keepLines/>
@@ -1217,7 +929,7 @@
     <w:semiHidden/>
     <w:unhideWhenUsed/>
     <w:qFormat/>
-    <w:rsid w:val="006B7A04"/>
+    <w:rsid w:val="004A0A1F"/>
     <w:pPr>
       <w:keepNext/>
       <w:keepLines/>
@@ -1240,7 +952,7 @@
     <w:semiHidden/>
     <w:unhideWhenUsed/>
     <w:qFormat/>
-    <w:rsid w:val="006B7A04"/>
+    <w:rsid w:val="004A0A1F"/>
     <w:pPr>
       <w:keepNext/>
       <w:keepLines/>
@@ -1261,7 +973,7 @@
     <w:semiHidden/>
     <w:unhideWhenUsed/>
     <w:qFormat/>
-    <w:rsid w:val="006B7A04"/>
+    <w:rsid w:val="004A0A1F"/>
     <w:pPr>
       <w:keepNext/>
       <w:keepLines/>
@@ -1284,7 +996,7 @@
     <w:semiHidden/>
     <w:unhideWhenUsed/>
     <w:qFormat/>
-    <w:rsid w:val="006B7A04"/>
+    <w:rsid w:val="004A0A1F"/>
     <w:pPr>
       <w:keepNext/>
       <w:keepLines/>
@@ -1305,7 +1017,7 @@
     <w:semiHidden/>
     <w:unhideWhenUsed/>
     <w:qFormat/>
-    <w:rsid w:val="006B7A04"/>
+    <w:rsid w:val="004A0A1F"/>
     <w:pPr>
       <w:keepNext/>
       <w:keepLines/>
@@ -1328,7 +1040,7 @@
     <w:semiHidden/>
     <w:unhideWhenUsed/>
     <w:qFormat/>
-    <w:rsid w:val="006B7A04"/>
+    <w:rsid w:val="004A0A1F"/>
     <w:pPr>
       <w:keepNext/>
       <w:keepLines/>
@@ -1343,6 +1055,7 @@
   <w:style w:type="character" w:default="1" w:styleId="DefaultParagraphFont">
     <w:name w:val="Default Paragraph Font"/>
     <w:uiPriority w:val="1"/>
+    <w:semiHidden/>
     <w:unhideWhenUsed/>
   </w:style>
   <w:style w:type="table" w:default="1" w:styleId="TableNormal">
@@ -1371,7 +1084,7 @@
     <w:basedOn w:val="DefaultParagraphFont"/>
     <w:link w:val="Heading1"/>
     <w:uiPriority w:val="9"/>
-    <w:rsid w:val="006B7A04"/>
+    <w:rsid w:val="004A0A1F"/>
     <w:rPr>
       <w:rFonts w:asciiTheme="majorHAnsi" w:eastAsiaTheme="majorEastAsia" w:hAnsiTheme="majorHAnsi" w:cstheme="majorBidi"/>
       <w:color w:val="0F4761" w:themeColor="accent1" w:themeShade="BF"/>
@@ -1385,7 +1098,7 @@
     <w:link w:val="Heading2"/>
     <w:uiPriority w:val="9"/>
     <w:semiHidden/>
-    <w:rsid w:val="006B7A04"/>
+    <w:rsid w:val="004A0A1F"/>
     <w:rPr>
       <w:rFonts w:asciiTheme="majorHAnsi" w:eastAsiaTheme="majorEastAsia" w:hAnsiTheme="majorHAnsi" w:cstheme="majorBidi"/>
       <w:color w:val="0F4761" w:themeColor="accent1" w:themeShade="BF"/>
@@ -1399,7 +1112,7 @@
     <w:link w:val="Heading3"/>
     <w:uiPriority w:val="9"/>
     <w:semiHidden/>
-    <w:rsid w:val="006B7A04"/>
+    <w:rsid w:val="004A0A1F"/>
     <w:rPr>
       <w:rFonts w:eastAsiaTheme="majorEastAsia" w:cstheme="majorBidi"/>
       <w:color w:val="0F4761" w:themeColor="accent1" w:themeShade="BF"/>
@@ -1413,7 +1126,7 @@
     <w:link w:val="Heading4"/>
     <w:uiPriority w:val="9"/>
     <w:semiHidden/>
-    <w:rsid w:val="006B7A04"/>
+    <w:rsid w:val="004A0A1F"/>
     <w:rPr>
       <w:rFonts w:eastAsiaTheme="majorEastAsia" w:cstheme="majorBidi"/>
       <w:i/>
@@ -1427,7 +1140,7 @@
     <w:link w:val="Heading5"/>
     <w:uiPriority w:val="9"/>
     <w:semiHidden/>
-    <w:rsid w:val="006B7A04"/>
+    <w:rsid w:val="004A0A1F"/>
     <w:rPr>
       <w:rFonts w:eastAsiaTheme="majorEastAsia" w:cstheme="majorBidi"/>
       <w:color w:val="0F4761" w:themeColor="accent1" w:themeShade="BF"/>
@@ -1439,7 +1152,7 @@
     <w:link w:val="Heading6"/>
     <w:uiPriority w:val="9"/>
     <w:semiHidden/>
-    <w:rsid w:val="006B7A04"/>
+    <w:rsid w:val="004A0A1F"/>
     <w:rPr>
       <w:rFonts w:eastAsiaTheme="majorEastAsia" w:cstheme="majorBidi"/>
       <w:i/>
@@ -1453,7 +1166,7 @@
     <w:link w:val="Heading7"/>
     <w:uiPriority w:val="9"/>
     <w:semiHidden/>
-    <w:rsid w:val="006B7A04"/>
+    <w:rsid w:val="004A0A1F"/>
     <w:rPr>
       <w:rFonts w:eastAsiaTheme="majorEastAsia" w:cstheme="majorBidi"/>
       <w:color w:val="595959" w:themeColor="text1" w:themeTint="A6"/>
@@ -1465,7 +1178,7 @@
     <w:link w:val="Heading8"/>
     <w:uiPriority w:val="9"/>
     <w:semiHidden/>
-    <w:rsid w:val="006B7A04"/>
+    <w:rsid w:val="004A0A1F"/>
     <w:rPr>
       <w:rFonts w:eastAsiaTheme="majorEastAsia" w:cstheme="majorBidi"/>
       <w:i/>
@@ -1479,7 +1192,7 @@
     <w:link w:val="Heading9"/>
     <w:uiPriority w:val="9"/>
     <w:semiHidden/>
-    <w:rsid w:val="006B7A04"/>
+    <w:rsid w:val="004A0A1F"/>
     <w:rPr>
       <w:rFonts w:eastAsiaTheme="majorEastAsia" w:cstheme="majorBidi"/>
       <w:color w:val="272727" w:themeColor="text1" w:themeTint="D8"/>
@@ -1492,7 +1205,7 @@
     <w:link w:val="TitleChar"/>
     <w:uiPriority w:val="10"/>
     <w:qFormat/>
-    <w:rsid w:val="006B7A04"/>
+    <w:rsid w:val="004A0A1F"/>
     <w:pPr>
       <w:spacing w:after="80" w:line="240" w:lineRule="auto"/>
       <w:contextualSpacing/>
@@ -1510,7 +1223,7 @@
     <w:basedOn w:val="DefaultParagraphFont"/>
     <w:link w:val="Title"/>
     <w:uiPriority w:val="10"/>
-    <w:rsid w:val="006B7A04"/>
+    <w:rsid w:val="004A0A1F"/>
     <w:rPr>
       <w:rFonts w:asciiTheme="majorHAnsi" w:eastAsiaTheme="majorEastAsia" w:hAnsiTheme="majorHAnsi" w:cstheme="majorBidi"/>
       <w:spacing w:val="-10"/>
@@ -1526,7 +1239,7 @@
     <w:link w:val="SubtitleChar"/>
     <w:uiPriority w:val="11"/>
     <w:qFormat/>
-    <w:rsid w:val="006B7A04"/>
+    <w:rsid w:val="004A0A1F"/>
     <w:pPr>
       <w:numPr>
         <w:ilvl w:val="1"/>
@@ -1545,7 +1258,7 @@
     <w:basedOn w:val="DefaultParagraphFont"/>
     <w:link w:val="Subtitle"/>
     <w:uiPriority w:val="11"/>
-    <w:rsid w:val="006B7A04"/>
+    <w:rsid w:val="004A0A1F"/>
     <w:rPr>
       <w:rFonts w:eastAsiaTheme="majorEastAsia" w:cstheme="majorBidi"/>
       <w:color w:val="595959" w:themeColor="text1" w:themeTint="A6"/>
@@ -1561,7 +1274,7 @@
     <w:link w:val="QuoteChar"/>
     <w:uiPriority w:val="29"/>
     <w:qFormat/>
-    <w:rsid w:val="006B7A04"/>
+    <w:rsid w:val="004A0A1F"/>
     <w:pPr>
       <w:spacing w:before="160"/>
       <w:jc w:val="center"/>
@@ -1577,7 +1290,7 @@
     <w:basedOn w:val="DefaultParagraphFont"/>
     <w:link w:val="Quote"/>
     <w:uiPriority w:val="29"/>
-    <w:rsid w:val="006B7A04"/>
+    <w:rsid w:val="004A0A1F"/>
     <w:rPr>
       <w:i/>
       <w:iCs/>
@@ -1589,7 +1302,7 @@
     <w:basedOn w:val="Normal"/>
     <w:uiPriority w:val="34"/>
     <w:qFormat/>
-    <w:rsid w:val="006B7A04"/>
+    <w:rsid w:val="004A0A1F"/>
     <w:pPr>
       <w:ind w:left="720"/>
       <w:contextualSpacing/>
@@ -1600,7 +1313,7 @@
     <w:basedOn w:val="DefaultParagraphFont"/>
     <w:uiPriority w:val="21"/>
     <w:qFormat/>
-    <w:rsid w:val="006B7A04"/>
+    <w:rsid w:val="004A0A1F"/>
     <w:rPr>
       <w:i/>
       <w:iCs/>
@@ -1614,7 +1327,7 @@
     <w:link w:val="IntenseQuoteChar"/>
     <w:uiPriority w:val="30"/>
     <w:qFormat/>
-    <w:rsid w:val="006B7A04"/>
+    <w:rsid w:val="004A0A1F"/>
     <w:pPr>
       <w:pBdr>
         <w:top w:val="single" w:sz="4" w:space="10" w:color="0F4761" w:themeColor="accent1" w:themeShade="BF"/>
@@ -1635,7 +1348,7 @@
     <w:basedOn w:val="DefaultParagraphFont"/>
     <w:link w:val="IntenseQuote"/>
     <w:uiPriority w:val="30"/>
-    <w:rsid w:val="006B7A04"/>
+    <w:rsid w:val="004A0A1F"/>
     <w:rPr>
       <w:i/>
       <w:iCs/>
@@ -1647,13 +1360,36 @@
     <w:basedOn w:val="DefaultParagraphFont"/>
     <w:uiPriority w:val="32"/>
     <w:qFormat/>
-    <w:rsid w:val="006B7A04"/>
+    <w:rsid w:val="004A0A1F"/>
     <w:rPr>
       <w:b/>
       <w:bCs/>
       <w:smallCaps/>
       <w:color w:val="0F4761" w:themeColor="accent1" w:themeShade="BF"/>
       <w:spacing w:val="5"/>
+    </w:rPr>
+  </w:style>
+  <w:style w:type="character" w:styleId="Hyperlink">
+    <w:name w:val="Hyperlink"/>
+    <w:basedOn w:val="DefaultParagraphFont"/>
+    <w:uiPriority w:val="99"/>
+    <w:unhideWhenUsed/>
+    <w:rsid w:val="004A0A1F"/>
+    <w:rPr>
+      <w:color w:val="467886" w:themeColor="hyperlink"/>
+      <w:u w:val="single"/>
+    </w:rPr>
+  </w:style>
+  <w:style w:type="character" w:styleId="UnresolvedMention">
+    <w:name w:val="Unresolved Mention"/>
+    <w:basedOn w:val="DefaultParagraphFont"/>
+    <w:uiPriority w:val="99"/>
+    <w:semiHidden/>
+    <w:unhideWhenUsed/>
+    <w:rsid w:val="004A0A1F"/>
+    <w:rPr>
+      <w:color w:val="605E5C"/>
+      <w:shd w:val="clear" w:color="auto" w:fill="E1DFDD"/>
     </w:rPr>
   </w:style>
 </w:styles>
@@ -1972,207 +1708,4 @@
     </a:ext>
   </a:extLst>
 </a:theme>
-</file>
-
-<file path=customXml/item1.xml><?xml version="1.0" encoding="utf-8"?>
-<ct:contentTypeSchema xmlns:ct="http://schemas.microsoft.com/office/2006/metadata/contentType" xmlns:ma="http://schemas.microsoft.com/office/2006/metadata/properties/metaAttributes" ct:_="" ma:_="" ma:contentTypeName="Document" ma:contentTypeID="0x010100D0D88FADAA66B14EB8182DB70CA6D5C8" ma:contentTypeVersion="5" ma:contentTypeDescription="Create a new document." ma:contentTypeScope="" ma:versionID="3c3cf88dbb4fea230a55386fca9491f9">
-  <xsd:schema xmlns:xsd="http://www.w3.org/2001/XMLSchema" xmlns:xs="http://www.w3.org/2001/XMLSchema" xmlns:p="http://schemas.microsoft.com/office/2006/metadata/properties" xmlns:ns3="b72806df-7a27-4b51-9804-b5f7550b27e7" targetNamespace="http://schemas.microsoft.com/office/2006/metadata/properties" ma:root="true" ma:fieldsID="3430162ef6d7b42f8ee97cb63dcffc3e" ns3:_="">
-    <xsd:import namespace="b72806df-7a27-4b51-9804-b5f7550b27e7"/>
-    <xsd:element name="properties">
-      <xsd:complexType>
-        <xsd:sequence>
-          <xsd:element name="documentManagement">
-            <xsd:complexType>
-              <xsd:all>
-                <xsd:element ref="ns3:MediaServiceDateTaken" minOccurs="0"/>
-                <xsd:element ref="ns3:MediaServiceMetadata" minOccurs="0"/>
-                <xsd:element ref="ns3:MediaServiceFastMetadata" minOccurs="0"/>
-                <xsd:element ref="ns3:MediaServiceSearchProperties" minOccurs="0"/>
-                <xsd:element ref="ns3:_activity" minOccurs="0"/>
-              </xsd:all>
-            </xsd:complexType>
-          </xsd:element>
-        </xsd:sequence>
-      </xsd:complexType>
-    </xsd:element>
-  </xsd:schema>
-  <xsd:schema xmlns:xsd="http://www.w3.org/2001/XMLSchema" xmlns:xs="http://www.w3.org/2001/XMLSchema" xmlns:dms="http://schemas.microsoft.com/office/2006/documentManagement/types" xmlns:pc="http://schemas.microsoft.com/office/infopath/2007/PartnerControls" targetNamespace="b72806df-7a27-4b51-9804-b5f7550b27e7" elementFormDefault="qualified">
-    <xsd:import namespace="http://schemas.microsoft.com/office/2006/documentManagement/types"/>
-    <xsd:import namespace="http://schemas.microsoft.com/office/infopath/2007/PartnerControls"/>
-    <xsd:element name="MediaServiceDateTaken" ma:index="8" nillable="true" ma:displayName="MediaServiceDateTaken" ma:hidden="true" ma:indexed="true" ma:internalName="MediaServiceDateTaken" ma:readOnly="true">
-      <xsd:simpleType>
-        <xsd:restriction base="dms:Text"/>
-      </xsd:simpleType>
-    </xsd:element>
-    <xsd:element name="MediaServiceMetadata" ma:index="9" nillable="true" ma:displayName="MediaServiceMetadata" ma:hidden="true" ma:internalName="MediaServiceMetadata" ma:readOnly="true">
-      <xsd:simpleType>
-        <xsd:restriction base="dms:Note"/>
-      </xsd:simpleType>
-    </xsd:element>
-    <xsd:element name="MediaServiceFastMetadata" ma:index="10" nillable="true" ma:displayName="MediaServiceFastMetadata" ma:hidden="true" ma:internalName="MediaServiceFastMetadata" ma:readOnly="true">
-      <xsd:simpleType>
-        <xsd:restriction base="dms:Note"/>
-      </xsd:simpleType>
-    </xsd:element>
-    <xsd:element name="MediaServiceSearchProperties" ma:index="11" nillable="true" ma:displayName="MediaServiceSearchProperties" ma:hidden="true" ma:internalName="MediaServiceSearchProperties" ma:readOnly="true">
-      <xsd:simpleType>
-        <xsd:restriction base="dms:Note"/>
-      </xsd:simpleType>
-    </xsd:element>
-    <xsd:element name="_activity" ma:index="12" nillable="true" ma:displayName="_activity" ma:hidden="true" ma:internalName="_activity">
-      <xsd:simpleType>
-        <xsd:restriction base="dms:Note"/>
-      </xsd:simpleType>
-    </xsd:element>
-  </xsd:schema>
-  <xsd:schema xmlns="http://schemas.openxmlformats.org/package/2006/metadata/core-properties" xmlns:xsd="http://www.w3.org/2001/XMLSchema" xmlns:xsi="http://www.w3.org/2001/XMLSchema-instance" xmlns:dc="http://purl.org/dc/elements/1.1/" xmlns:dcterms="http://purl.org/dc/terms/" xmlns:odoc="http://schemas.microsoft.com/internal/obd" targetNamespace="http://schemas.openxmlformats.org/package/2006/metadata/core-properties" elementFormDefault="qualified" attributeFormDefault="unqualified" blockDefault="#all">
-    <xsd:import namespace="http://purl.org/dc/elements/1.1/" schemaLocation="http://dublincore.org/schemas/xmls/qdc/2003/04/02/dc.xsd"/>
-    <xsd:import namespace="http://purl.org/dc/terms/" schemaLocation="http://dublincore.org/schemas/xmls/qdc/2003/04/02/dcterms.xsd"/>
-    <xsd:element name="coreProperties" type="CT_coreProperties"/>
-    <xsd:complexType name="CT_coreProperties">
-      <xsd:all>
-        <xsd:element ref="dc:creator" minOccurs="0" maxOccurs="1"/>
-        <xsd:element ref="dcterms:created" minOccurs="0" maxOccurs="1"/>
-        <xsd:element ref="dc:identifier" minOccurs="0" maxOccurs="1"/>
-        <xsd:element name="contentType" minOccurs="0" maxOccurs="1" type="xsd:string" ma:index="0" ma:displayName="Content Type"/>
-        <xsd:element ref="dc:title" minOccurs="0" maxOccurs="1" ma:index="4" ma:displayName="Title"/>
-        <xsd:element ref="dc:subject" minOccurs="0" maxOccurs="1"/>
-        <xsd:element ref="dc:description" minOccurs="0" maxOccurs="1"/>
-        <xsd:element name="keywords" minOccurs="0" maxOccurs="1" type="xsd:string"/>
-        <xsd:element ref="dc:language" minOccurs="0" maxOccurs="1"/>
-        <xsd:element name="category" minOccurs="0" maxOccurs="1" type="xsd:string"/>
-        <xsd:element name="version" minOccurs="0" maxOccurs="1" type="xsd:string"/>
-        <xsd:element name="revision" minOccurs="0" maxOccurs="1" type="xsd:string">
-          <xsd:annotation>
-            <xsd:documentation>
-                        This value indicates the number of saves or revisions. The application is responsible for updating this value after each revision.
-                    </xsd:documentation>
-          </xsd:annotation>
-        </xsd:element>
-        <xsd:element name="lastModifiedBy" minOccurs="0" maxOccurs="1" type="xsd:string"/>
-        <xsd:element ref="dcterms:modified" minOccurs="0" maxOccurs="1"/>
-        <xsd:element name="contentStatus" minOccurs="0" maxOccurs="1" type="xsd:string"/>
-      </xsd:all>
-    </xsd:complexType>
-  </xsd:schema>
-  <xs:schema xmlns:pc="http://schemas.microsoft.com/office/infopath/2007/PartnerControls" xmlns:xs="http://www.w3.org/2001/XMLSchema" targetNamespace="http://schemas.microsoft.com/office/infopath/2007/PartnerControls" elementFormDefault="qualified" attributeFormDefault="unqualified">
-    <xs:element name="Person">
-      <xs:complexType>
-        <xs:sequence>
-          <xs:element ref="pc:DisplayName" minOccurs="0"/>
-          <xs:element ref="pc:AccountId" minOccurs="0"/>
-          <xs:element ref="pc:AccountType" minOccurs="0"/>
-        </xs:sequence>
-      </xs:complexType>
-    </xs:element>
-    <xs:element name="DisplayName" type="xs:string"/>
-    <xs:element name="AccountId" type="xs:string"/>
-    <xs:element name="AccountType" type="xs:string"/>
-    <xs:element name="BDCAssociatedEntity">
-      <xs:complexType>
-        <xs:sequence>
-          <xs:element ref="pc:BDCEntity" minOccurs="0" maxOccurs="unbounded"/>
-        </xs:sequence>
-        <xs:attribute ref="pc:EntityNamespace"/>
-        <xs:attribute ref="pc:EntityName"/>
-        <xs:attribute ref="pc:SystemInstanceName"/>
-        <xs:attribute ref="pc:AssociationName"/>
-      </xs:complexType>
-    </xs:element>
-    <xs:attribute name="EntityNamespace" type="xs:string"/>
-    <xs:attribute name="EntityName" type="xs:string"/>
-    <xs:attribute name="SystemInstanceName" type="xs:string"/>
-    <xs:attribute name="AssociationName" type="xs:string"/>
-    <xs:element name="BDCEntity">
-      <xs:complexType>
-        <xs:sequence>
-          <xs:element ref="pc:EntityDisplayName" minOccurs="0"/>
-          <xs:element ref="pc:EntityInstanceReference" minOccurs="0"/>
-          <xs:element ref="pc:EntityId1" minOccurs="0"/>
-          <xs:element ref="pc:EntityId2" minOccurs="0"/>
-          <xs:element ref="pc:EntityId3" minOccurs="0"/>
-          <xs:element ref="pc:EntityId4" minOccurs="0"/>
-          <xs:element ref="pc:EntityId5" minOccurs="0"/>
-        </xs:sequence>
-      </xs:complexType>
-    </xs:element>
-    <xs:element name="EntityDisplayName" type="xs:string"/>
-    <xs:element name="EntityInstanceReference" type="xs:string"/>
-    <xs:element name="EntityId1" type="xs:string"/>
-    <xs:element name="EntityId2" type="xs:string"/>
-    <xs:element name="EntityId3" type="xs:string"/>
-    <xs:element name="EntityId4" type="xs:string"/>
-    <xs:element name="EntityId5" type="xs:string"/>
-    <xs:element name="Terms">
-      <xs:complexType>
-        <xs:sequence>
-          <xs:element ref="pc:TermInfo" minOccurs="0" maxOccurs="unbounded"/>
-        </xs:sequence>
-      </xs:complexType>
-    </xs:element>
-    <xs:element name="TermInfo">
-      <xs:complexType>
-        <xs:sequence>
-          <xs:element ref="pc:TermName" minOccurs="0"/>
-          <xs:element ref="pc:TermId" minOccurs="0"/>
-        </xs:sequence>
-      </xs:complexType>
-    </xs:element>
-    <xs:element name="TermName" type="xs:string"/>
-    <xs:element name="TermId" type="xs:string"/>
-  </xs:schema>
-</ct:contentTypeSchema>
-</file>
-
-<file path=customXml/item2.xml><?xml version="1.0" encoding="utf-8"?>
-<?mso-contentType ?>
-<FormTemplates xmlns="http://schemas.microsoft.com/sharepoint/v3/contenttype/forms">
-  <Display>DocumentLibraryForm</Display>
-  <Edit>DocumentLibraryForm</Edit>
-  <New>DocumentLibraryForm</New>
-</FormTemplates>
-</file>
-
-<file path=customXml/item3.xml><?xml version="1.0" encoding="utf-8"?>
-<p:properties xmlns:p="http://schemas.microsoft.com/office/2006/metadata/properties" xmlns:xsi="http://www.w3.org/2001/XMLSchema-instance" xmlns:pc="http://schemas.microsoft.com/office/infopath/2007/PartnerControls">
-  <documentManagement>
-    <_activity xmlns="b72806df-7a27-4b51-9804-b5f7550b27e7" xsi:nil="true"/>
-  </documentManagement>
-</p:properties>
-</file>
-
-<file path=customXml/itemProps1.xml><?xml version="1.0" encoding="utf-8"?>
-<ds:datastoreItem xmlns:ds="http://schemas.openxmlformats.org/officeDocument/2006/customXml" ds:itemID="{6784E320-4667-41D4-9560-BE580918AC21}">
-  <ds:schemaRefs>
-    <ds:schemaRef ds:uri="http://schemas.microsoft.com/office/2006/metadata/contentType"/>
-    <ds:schemaRef ds:uri="http://schemas.microsoft.com/office/2006/metadata/properties/metaAttributes"/>
-    <ds:schemaRef ds:uri="http://www.w3.org/2001/XMLSchema"/>
-    <ds:schemaRef ds:uri="http://schemas.microsoft.com/office/2006/metadata/properties"/>
-    <ds:schemaRef ds:uri="b72806df-7a27-4b51-9804-b5f7550b27e7"/>
-    <ds:schemaRef ds:uri="http://schemas.microsoft.com/office/2006/documentManagement/types"/>
-    <ds:schemaRef ds:uri="http://schemas.microsoft.com/office/infopath/2007/PartnerControls"/>
-    <ds:schemaRef ds:uri="http://schemas.openxmlformats.org/package/2006/metadata/core-properties"/>
-    <ds:schemaRef ds:uri="http://purl.org/dc/elements/1.1/"/>
-    <ds:schemaRef ds:uri="http://purl.org/dc/terms/"/>
-    <ds:schemaRef ds:uri="http://schemas.microsoft.com/internal/obd"/>
-  </ds:schemaRefs>
-</ds:datastoreItem>
-</file>
-
-<file path=customXml/itemProps2.xml><?xml version="1.0" encoding="utf-8"?>
-<ds:datastoreItem xmlns:ds="http://schemas.openxmlformats.org/officeDocument/2006/customXml" ds:itemID="{80AFFEB9-4583-4CB4-B65E-F9FA6B453B80}">
-  <ds:schemaRefs>
-    <ds:schemaRef ds:uri="http://schemas.microsoft.com/sharepoint/v3/contenttype/forms"/>
-  </ds:schemaRefs>
-</ds:datastoreItem>
-</file>
-
-<file path=customXml/itemProps3.xml><?xml version="1.0" encoding="utf-8"?>
-<ds:datastoreItem xmlns:ds="http://schemas.openxmlformats.org/officeDocument/2006/customXml" ds:itemID="{F107E470-F0CC-4942-9196-997496FD7E82}">
-  <ds:schemaRefs>
-    <ds:schemaRef ds:uri="http://schemas.microsoft.com/office/2006/metadata/properties"/>
-    <ds:schemaRef ds:uri="http://schemas.microsoft.com/office/infopath/2007/PartnerControls"/>
-    <ds:schemaRef ds:uri="b72806df-7a27-4b51-9804-b5f7550b27e7"/>
-  </ds:schemaRefs>
-</ds:datastoreItem>
 </file>
</xml_diff>

<commit_message>
Final submission: Programming Exercise 1 design document
</commit_message>
<xml_diff>
--- a/Programming_exercise_1/MariaGalante_ProgrammingExercise_1.docx
+++ b/Programming_exercise_1/MariaGalante_ProgrammingExercise_1.docx
@@ -66,6 +66,66 @@
       <w:r>
         <w:t xml:space="preserve"> This program simulates the pre-sale of cinema tickets with purchase limits and input validation.</w:t>
       </w:r>
+      <w:r>
+        <w:t xml:space="preserve"> The program</w:t>
+      </w:r>
+      <w:r>
+        <w:t xml:space="preserve"> pre-sell</w:t>
+      </w:r>
+      <w:r>
+        <w:t>s</w:t>
+      </w:r>
+      <w:r>
+        <w:t xml:space="preserve"> a limited number of cinema tickets. </w:t>
+      </w:r>
+      <w:r>
+        <w:t xml:space="preserve"> Users will be prompted for number of tickets wanted but </w:t>
+      </w:r>
+      <w:r>
+        <w:t>can</w:t>
+      </w:r>
+      <w:r>
+        <w:t xml:space="preserve"> only</w:t>
+      </w:r>
+      <w:r>
+        <w:t xml:space="preserve"> buy up to 4 tickets. </w:t>
+      </w:r>
+      <w:r>
+        <w:t xml:space="preserve">The total tickets able to be sold are </w:t>
+      </w:r>
+      <w:r>
+        <w:t>20 tickets</w:t>
+      </w:r>
+      <w:r>
+        <w:t>. After p</w:t>
+      </w:r>
+      <w:r>
+        <w:t>rompt</w:t>
+      </w:r>
+      <w:r>
+        <w:t xml:space="preserve">ing </w:t>
+      </w:r>
+      <w:r>
+        <w:t>the user for the desired number of tickets</w:t>
+      </w:r>
+      <w:r>
+        <w:t xml:space="preserve">, the program will </w:t>
+      </w:r>
+      <w:r>
+        <w:t xml:space="preserve">display the number of remaining tickets after their purchase. </w:t>
+      </w:r>
+      <w:r>
+        <w:t>This will r</w:t>
+      </w:r>
+      <w:r>
+        <w:t xml:space="preserve">epeat until all tickets have been sold. </w:t>
+      </w:r>
+      <w:r>
+        <w:t>After that the program will display a “Sold out” message and</w:t>
+      </w:r>
+      <w:r>
+        <w:t xml:space="preserve"> the total number of buyers.</w:t>
+      </w:r>
     </w:p>
     <w:p>
       <w:pPr>
@@ -103,11 +163,9 @@
       <w:r>
         <w:t xml:space="preserve">Displays the </w:t>
       </w:r>
-      <w:proofErr w:type="gramStart"/>
       <w:r>
         <w:t>final results</w:t>
       </w:r>
-      <w:proofErr w:type="gramEnd"/>
       <w:r>
         <w:t xml:space="preserve"> after tickets are sold out.</w:t>
       </w:r>
@@ -179,6 +237,7 @@
           <w:b/>
           <w:bCs/>
         </w:rPr>
+        <w:lastRenderedPageBreak/>
         <w:t xml:space="preserve">## Function: </w:t>
       </w:r>
       <w:proofErr w:type="spellStart"/>
@@ -199,7 +258,6 @@
     <w:p/>
     <w:p>
       <w:r>
-        <w:lastRenderedPageBreak/>
         <w:t>Parameters:</w:t>
       </w:r>
     </w:p>
@@ -1055,7 +1113,6 @@
   <w:style w:type="character" w:default="1" w:styleId="DefaultParagraphFont">
     <w:name w:val="Default Paragraph Font"/>
     <w:uiPriority w:val="1"/>
-    <w:semiHidden/>
     <w:unhideWhenUsed/>
   </w:style>
   <w:style w:type="table" w:default="1" w:styleId="TableNormal">

</xml_diff>